<commit_message>
alaska: amicus and reply briefs gated (latex XENG pass, unsplit notes landed); engines regenerated for the model at HEAD; answering, merits, motion stay report (fb-595.54.57)
Co-Authored-By: Claude Opus 5.5 <noreply@anthropic.com>
</commit_message>
<xml_diff>
--- a/courts/ninth-circuit/alaska/state/supreme-court/amicus-brief/usage/OUTPUT-amicus-brief.docx
+++ b/courts/ninth-circuit/alaska/state/supreme-court/amicus-brief/usage/OUTPUT-amicus-brief.docx
@@ -1799,7 +1799,7 @@
         <w:tab/>
       </w:r>
       <w:r>
-        <w:t xml:space="preserve">33</w:t>
+        <w:t xml:space="preserve">34</w:t>
       </w:r>
     </w:p>
     <w:p>
@@ -2141,7 +2141,7 @@
         <w:pStyle w:val="BodyText"/>
       </w:pPr>
       <w:r>
-        <w:t xml:space="preserve">The testimony of the three witnesses to the incident—Mr. Olson, Officer Joseph, and Officer Simon—differed on several points. Mr. Olson and the officers testified to very different circumstances regarding the nature of the tasing and Mr. Olson’s resistance. Mr. Olson admitted to kicking “in the beginning” but testified that the officers “continued to tase [him ] after [he] stopped resisting and became compliant.” [Tr. 646]; [Tr. 652</w:t>
+        <w:t xml:space="preserve">The testimony of the three witnesses to the incident—Mr. Olson, Officer Joseph, and Officer Simon—differed on several points. Mr. Olson and the officers testified to very different circumstances regarding the nature of the tasing and Mr. Olson’s resistance. Mr. Olson admitted to kicking “in the beginning” but testified that the officers “continued to tase [him ] after [he] stopped resisting and became compliant.” [Tr. 646]; [Tr. 652</w:t>
       </w:r>
       <w:r>
         <w:noBreakHyphen/>
@@ -6973,7 +6973,7 @@
         <w:t xml:space="preserve"> </w:t>
       </w:r>
       <w:r>
-        <w:t xml:space="preserve">Indeed, the individual’s posture is an aspect of the Graham factors regarding “whether the suspect poses an immediate threat to the safety of the officers or others and whether he is . . . attempting to evade arrest by flight.”</w:t>
+        <w:t xml:space="preserve">Indeed, the individual’s posture is an aspect of the Graham factors regarding “whether the suspect poses an immediate threat to the safety of the officers or others and whether he is . . . attempting to evade arrest by flight.”</w:t>
       </w:r>
       <w:r>
         <w:rPr>
@@ -8100,7 +8100,7 @@
         <w:t xml:space="preserve"> </w:t>
       </w:r>
       <w:r>
-        <w:t xml:space="preserve">Contrast [Tr. 1193] (“[T]here is a difference of fact between their side and our side and the difference of fact is whether or not he was still actively resisting. Actively resisting. If he was actively resisting, we were entitled to use a taser on him. If he was not actively resisting, we were not entitled to use the taser.”) with [Tr. 1275] (“We did have the testimony of Mr. Olson who admitted on the stand that he resisted to the end. . . .”).</w:t>
+        <w:t xml:space="preserve">Contrast [Tr. 1193] (“[T]here is a difference of fact between their side and our side and the difference of fact is whether or not he was still actively resisting. Actively resisting. If he was actively resisting, we were entitled to use a taser on him. If he was not actively resisting, we were not entitled to use the taser.”) with [Tr. 1275] (“We did have the testimony of Mr. Olson who admitted on the stand that he resisted to the end. . . .”).</w:t>
       </w:r>
     </w:p>
   </w:footnote>
@@ -8739,7 +8739,7 @@
         <w:t xml:space="preserve"> </w:t>
       </w:r>
       <w:r>
-        <w:t xml:space="preserve">The Department of Justice recommends that officers using tasers should “stop to assess the situation” after each cycle of electricity. U.S. Dep’t of Justice, Letter to Orange County Sherriff’s Office, August 20, 2008, at 11 available at http://www.justice.gov/​crt/​about/​spl/​documents/​orangecty_ta_ltr.pdf [“DOJ letter”]. The Department of Justice also notes that: “As subjects are often unable to hear or respond to commands during the cycling of the ECW [Electronic Control Weapon], it is ineffective to give commands while deploying the ECW, as deputies may mistakenly interpret the subject’s failure to respond to commands as active physical resistance.” Id.</w:t>
+        <w:t xml:space="preserve">The Department of Justice recommends that officers using tasers should “stop to assess the situation” after each cycle of electricity. U.S. Dep’t of Justice, Letter to Orange County Sherriff’s Office, August 20, 2008, at 11 available at http://​www.​justice.​gov/​crt/​about/​spl/​documents/​orangecty_ta_ltr.​pdf [“DOJ letter”]. The Department of Justice also notes that: “As subjects are often unable to hear or respond to commands during the cycling of the ECW [Electronic Control Weapon], it is ineffective to give commands while deploying the ECW, as deputies may mistakenly interpret the subject’s failure to respond to commands as active physical resistance.” Id.</w:t>
       </w:r>
     </w:p>
   </w:footnote>
@@ -9663,6 +9663,7 @@
     <w:unhideWhenUsed/>
     <w:qFormat/>
     <w:pPr>
+      <w:keepLines/>
       <w:spacing w:before="0" w:after="140" w:line="299" w:lineRule="exact"/>
     </w:pPr>
     <w:rPr>
@@ -9913,6 +9914,33 @@
     <w:pPr>
       <w:spacing w:before="0" w:after="0" w:line="299" w:lineRule="exact"/>
       <w:ind w:left="2160" w:hanging="720"/>
+    </w:pPr>
+  </w:style>
+  <w:style w:type="paragraph" w:customStyle="1" w:styleId="XdQuoteList1">
+    <w:name w:val="Xd Quote List 1"/>
+    <w:basedOn w:val="Normal"/>
+    <w:qFormat/>
+    <w:pPr>
+      <w:spacing w:before="0" w:after="0" w:line="299" w:lineRule="exact"/>
+      <w:ind w:left="1440" w:right="720" w:hanging="720"/>
+    </w:pPr>
+  </w:style>
+  <w:style w:type="paragraph" w:customStyle="1" w:styleId="XdQuoteList2">
+    <w:name w:val="Xd Quote List 2"/>
+    <w:basedOn w:val="Normal"/>
+    <w:qFormat/>
+    <w:pPr>
+      <w:spacing w:before="0" w:after="0" w:line="299" w:lineRule="exact"/>
+      <w:ind w:left="2160" w:right="720" w:hanging="720"/>
+    </w:pPr>
+  </w:style>
+  <w:style w:type="paragraph" w:customStyle="1" w:styleId="XdQuoteList3">
+    <w:name w:val="Xd Quote List 3"/>
+    <w:basedOn w:val="Normal"/>
+    <w:qFormat/>
+    <w:pPr>
+      <w:spacing w:before="0" w:after="0" w:line="299" w:lineRule="exact"/>
+      <w:ind w:left="2880" w:right="720" w:hanging="720"/>
     </w:pPr>
   </w:style>
   <w:style w:type="paragraph" w:customStyle="1" w:styleId="XdList1">

</xml_diff>